<commit_message>
Feature: Update documentation formatting for front panel connector map and button input pins
</commit_message>
<xml_diff>
--- a/docs/TinyControlBoard-Documentation.docx
+++ b/docs/TinyControlBoard-Documentation.docx
@@ -10135,13 +10135,31 @@
     </w:p>
     <w:p>
       <w:pPr>
+        <w:rPr>
+          <w:caps/>
+          <w:color w:val="243F60" w:themeColor="accent1" w:themeShade="7F"/>
+          <w:spacing w:val="15"/>
+        </w:rPr>
+      </w:pPr>
+      <w:r>
+        <w:br w:type="page"/>
+      </w:r>
+    </w:p>
+    <w:p>
+      <w:pPr>
         <w:pStyle w:val="Heading3"/>
       </w:pPr>
       <w:r>
+        <w:lastRenderedPageBreak/>
         <w:t>3.3 Front Panel Connector Map</w:t>
       </w:r>
     </w:p>
     <w:p>
+      <w:pPr>
+        <w:rPr>
+          <w:u w:val="single"/>
+        </w:rPr>
+      </w:pPr>
       <w:r>
         <w:t xml:space="preserve">This table maps the physical front-panel connector pins to firmware symbols. The schematic image is: </w:t>
       </w:r>
@@ -10153,23 +10171,7 @@
       </w:r>
     </w:p>
     <w:p>
-      <w:pPr>
-        <w:rPr>
-          <w:caps/>
-          <w:color w:val="365F91" w:themeColor="accent1" w:themeShade="BF"/>
-          <w:spacing w:val="10"/>
-        </w:rPr>
-      </w:pPr>
-      <w:r>
-        <w:br w:type="page"/>
-      </w:r>
-    </w:p>
-    <w:p>
-      <w:pPr>
-        <w:pStyle w:val="Heading4"/>
-      </w:pPr>
-      <w:r>
-        <w:lastRenderedPageBreak/>
+      <w:r>
         <w:t>Power and Ground</w:t>
       </w:r>
     </w:p>
@@ -10472,26 +10474,12 @@
         </w:tc>
       </w:tr>
     </w:tbl>
-    <w:p>
-      <w:pPr>
-        <w:sectPr>
-          <w:pgSz w:w="15840" w:h="12240" w:orient="landscape"/>
-          <w:pgMar w:top="1080" w:right="1080" w:bottom="1008" w:left="1080" w:header="504" w:footer="504" w:gutter="0"/>
-          <w:cols w:space="720"/>
-          <w:docGrid w:linePitch="360"/>
-        </w:sectPr>
-      </w:pPr>
-    </w:p>
-    <w:p>
-      <w:pPr>
-        <w:pStyle w:val="Heading4"/>
-      </w:pPr>
-      <w:r>
-        <w:lastRenderedPageBreak/>
+    <w:p/>
+    <w:p>
+      <w:r>
         <w:t>Button Input Pins</w:t>
       </w:r>
     </w:p>
-    <w:p/>
     <w:tbl>
       <w:tblPr>
         <w:tblStyle w:val="TableGrid"/>
@@ -12335,12 +12323,6 @@
     </w:p>
     <w:p>
       <w:r>
-        <w:br w:type="page"/>
-      </w:r>
-    </w:p>
-    <w:p>
-      <w:r>
-        <w:lastRenderedPageBreak/>
         <w:t>SPI Button LED Output Pins</w:t>
       </w:r>
     </w:p>

</xml_diff>